<commit_message>
Add new reference file for pandoc
</commit_message>
<xml_diff>
--- a/Michael_Forbes_CV.docx
+++ b/Michael_Forbes_CV.docx
@@ -5,7 +5,7 @@
     <w:bookmarkStart w:id="34" w:name="michael-forbes"/>
     <w:p>
       <w:pPr>
-        <w:pStyle w:val="Nagwek1"/>
+        <w:pStyle w:val="Heading1"/>
       </w:pPr>
       <w:r>
         <w:t xml:space="preserve">Michael Forbes</w:t>
@@ -36,7 +36,7 @@
       <w:hyperlink r:id="rId20">
         <w:r>
           <w:rPr>
-            <w:rStyle w:val="hyperlink"/>
+            <w:rStyle w:val="Hyperlink"/>
           </w:rPr>
           <w:t xml:space="preserve">linkedin.com/in/1michaelforbes</w:t>
         </w:r>
@@ -69,7 +69,7 @@
           <w:iCs/>
           <w:i/>
         </w:rPr>
-        <w:t xml:space="preserve">Last updated: 19 August 2025 at 19:30 UTC</w:t>
+        <w:t xml:space="preserve">Last updated: 20 August 2025 at 12:30 UTC</w:t>
       </w:r>
     </w:p>
     <w:p>
@@ -1026,7 +1026,7 @@
     <w:bookmarkEnd w:id="34"/>
     <w:sectPr>
       <w:pgSz w:h="841.90pt" w:w="595.30pt"/>
-      <w:pgMar w:bottom="70.85pt" w:footer="35.40pt" w:gutter="0pt" w:header="35.40pt" w:left="70.85pt" w:right="70.85pt" w:top="70.85pt"/>
+      <w:pgMar w:bottom="72pt" w:footer="35.40pt" w:gutter="0pt" w:header="35.40pt" w:left="72pt" w:right="72pt" w:top="72pt"/>
       <w:cols w:space="35.40pt"/>
       <w:docGrid w:linePitch="360"/>
     </w:sectPr>
@@ -1058,22 +1058,22 @@
 </file>
 
 <file path=word/numbering.xml><?xml version="1.0" encoding="utf-8"?>
-<w:numbering xmlns:m="http://purl.oclc.org/ooxml/officeDocument/math" xmlns:mc="http://schemas.openxmlformats.org/markup-compatibility/2006" xmlns:o="urn:schemas-microsoft-com:office:office" xmlns:r="http://purl.oclc.org/ooxml/officeDocument/relationships" xmlns:v="urn:schemas-microsoft-com:vml" xmlns:w="http://purl.oclc.org/ooxml/wordprocessingml/main" xmlns:w10="urn:schemas-microsoft-com:office:word" xmlns:w14="http://schemas.microsoft.com/office/word/2010/wordml" xmlns:w15="http://schemas.microsoft.com/office/word/2012/wordml" xmlns:wne="http://schemas.microsoft.com/office/word/2006/wordml" xmlns:wp="http://purl.oclc.org/ooxml/drawingml/wordprocessingDrawing" xmlns:wp14="http://schemas.microsoft.com/office/word/2010/wordprocessingDrawing" xmlns:wpi="http://schemas.microsoft.com/office/word/2010/wordprocessingInk" mc:Ignorable="w14 w15 wne wp14">
+<w:numbering xmlns:aink="http://schemas.microsoft.com/office/drawing/2016/ink" xmlns:am3d="http://schemas.microsoft.com/office/drawing/2017/model3d" xmlns:cx="http://schemas.microsoft.com/office/drawing/2014/chartex" xmlns:cx1="http://schemas.microsoft.com/office/drawing/2015/9/8/chartex" xmlns:cx2="http://schemas.microsoft.com/office/drawing/2015/10/21/chartex" xmlns:cx3="http://schemas.microsoft.com/office/drawing/2016/5/9/chartex" xmlns:cx4="http://schemas.microsoft.com/office/drawing/2016/5/10/chartex" xmlns:cx5="http://schemas.microsoft.com/office/drawing/2016/5/11/chartex" xmlns:cx6="http://schemas.microsoft.com/office/drawing/2016/5/12/chartex" xmlns:cx7="http://schemas.microsoft.com/office/drawing/2016/5/13/chartex" xmlns:cx8="http://schemas.microsoft.com/office/drawing/2016/5/14/chartex" xmlns:m="http://purl.oclc.org/ooxml/officeDocument/math" xmlns:mc="http://schemas.openxmlformats.org/markup-compatibility/2006" xmlns:o="urn:schemas-microsoft-com:office:office" xmlns:oel="http://schemas.microsoft.com/office/2019/extlst" xmlns:r="http://purl.oclc.org/ooxml/officeDocument/relationships" xmlns:v="urn:schemas-microsoft-com:vml" xmlns:w="http://purl.oclc.org/ooxml/wordprocessingml/main" xmlns:w10="urn:schemas-microsoft-com:office:word" xmlns:w14="http://schemas.microsoft.com/office/word/2010/wordml" xmlns:w15="http://schemas.microsoft.com/office/word/2012/wordml" xmlns:w16="http://schemas.microsoft.com/office/word/2018/wordml" xmlns:w16cex="http://schemas.microsoft.com/office/word/2018/wordml/cex" xmlns:w16cid="http://schemas.microsoft.com/office/word/2016/wordml/cid" xmlns:w16du="http://schemas.microsoft.com/office/word/2023/wordml/word16du" xmlns:w16sdtdh="http://schemas.microsoft.com/office/word/2020/wordml/sdtdatahash" xmlns:w16sdtfl="http://schemas.microsoft.com/office/word/2024/wordml/sdtformatlock" xmlns:w16se="http://schemas.microsoft.com/office/word/2015/wordml/symex" xmlns:wne="http://schemas.microsoft.com/office/word/2006/wordml" xmlns:wp="http://purl.oclc.org/ooxml/drawingml/wordprocessingDrawing" xmlns:wp14="http://schemas.microsoft.com/office/word/2010/wordprocessingDrawing" xmlns:wpi="http://schemas.microsoft.com/office/word/2010/wordprocessingInk" mc:Ignorable="w14 w15 w16se w16cid w16 w16cex w16sdtdh w16sdtfl w16du wne wp14">
   <w:abstractNum w:abstractNumId="0" w15:restartNumberingAfterBreak="0">
-    <w:nsid w:val="FFFFFF89"/>
+    <w:nsid w:val="FFFFFF83"/>
     <w:multiLevelType w:val="singleLevel"/>
-    <w:tmpl w:val="8BA47B26"/>
+    <w:tmpl w:val="FD1A89EC"/>
     <w:lvl w:ilvl="0">
       <w:start w:val="1"/>
       <w:numFmt w:val="bullet"/>
-      <w:pStyle w:val="Listapunktowana"/>
+      <w:pStyle w:val="ListBullet2"/>
       <w:lvlText w:val=""/>
       <w:lvlJc w:val="start"/>
       <w:pPr>
         <w:tabs>
-          <w:tab w:pos="18pt" w:val="num"/>
+          <w:tab w:pos="32.15pt" w:val="num"/>
         </w:tabs>
-        <w:ind w:hanging="18pt" w:start="18pt"/>
+        <w:ind w:hanging="18pt" w:start="32.15pt"/>
       </w:pPr>
       <w:rPr>
         <w:rFonts w:ascii="Symbol" w:hAnsi="Symbol" w:hint="default"/>
@@ -1081,290 +1081,24 @@
     </w:lvl>
   </w:abstractNum>
   <w:abstractNum w:abstractNumId="1" w15:restartNumberingAfterBreak="0">
-    <w:nsid w:val="08D75AD0"/>
-    <w:multiLevelType w:val="multilevel"/>
-    <w:tmpl w:val="6144FA36"/>
+    <w:nsid w:val="FFFFFF89"/>
+    <w:multiLevelType w:val="singleLevel"/>
+    <w:tmpl w:val="3618B0A2"/>
     <w:lvl w:ilvl="0">
       <w:start w:val="1"/>
-      <w:numFmt w:val="decimal"/>
-      <w:pStyle w:val="Styl4"/>
-      <w:lvlText w:val="%1."/>
+      <w:numFmt w:val="bullet"/>
+      <w:pStyle w:val="ListBullet"/>
+      <w:lvlText w:val=""/>
       <w:lvlJc w:val="start"/>
       <w:pPr>
         <w:tabs>
-          <w:tab w:pos="36pt" w:val="num"/>
+          <w:tab w:pos="18pt" w:val="num"/>
         </w:tabs>
-        <w:ind w:hanging="36pt" w:start="36pt"/>
-      </w:pPr>
-    </w:lvl>
-    <w:lvl w:ilvl="1">
-      <w:start w:val="1"/>
-      <w:numFmt w:val="decimal"/>
-      <w:lvlText w:val="%2."/>
-      <w:lvlJc w:val="start"/>
-      <w:pPr>
-        <w:tabs>
-          <w:tab w:pos="72pt" w:val="num"/>
-        </w:tabs>
-        <w:ind w:hanging="36pt" w:start="72pt"/>
-      </w:pPr>
-    </w:lvl>
-    <w:lvl w:ilvl="2">
-      <w:start w:val="1"/>
-      <w:numFmt w:val="decimal"/>
-      <w:lvlText w:val="%3."/>
-      <w:lvlJc w:val="start"/>
-      <w:pPr>
-        <w:tabs>
-          <w:tab w:pos="108pt" w:val="num"/>
-        </w:tabs>
-        <w:ind w:hanging="36pt" w:start="108pt"/>
-      </w:pPr>
-    </w:lvl>
-    <w:lvl w:ilvl="3">
-      <w:start w:val="1"/>
-      <w:numFmt w:val="decimal"/>
-      <w:lvlText w:val="%4."/>
-      <w:lvlJc w:val="start"/>
-      <w:pPr>
-        <w:tabs>
-          <w:tab w:pos="144pt" w:val="num"/>
-        </w:tabs>
-        <w:ind w:hanging="36pt" w:start="144pt"/>
-      </w:pPr>
-    </w:lvl>
-    <w:lvl w:ilvl="4">
-      <w:start w:val="1"/>
-      <w:numFmt w:val="decimal"/>
-      <w:lvlText w:val="%5."/>
-      <w:lvlJc w:val="start"/>
-      <w:pPr>
-        <w:tabs>
-          <w:tab w:pos="180pt" w:val="num"/>
-        </w:tabs>
-        <w:ind w:hanging="36pt" w:start="180pt"/>
-      </w:pPr>
-    </w:lvl>
-    <w:lvl w:ilvl="5">
-      <w:start w:val="1"/>
-      <w:numFmt w:val="decimal"/>
-      <w:lvlText w:val="%6."/>
-      <w:lvlJc w:val="start"/>
-      <w:pPr>
-        <w:tabs>
-          <w:tab w:pos="216pt" w:val="num"/>
-        </w:tabs>
-        <w:ind w:hanging="36pt" w:start="216pt"/>
-      </w:pPr>
-    </w:lvl>
-    <w:lvl w:ilvl="6">
-      <w:start w:val="1"/>
-      <w:numFmt w:val="decimal"/>
-      <w:lvlText w:val="%7."/>
-      <w:lvlJc w:val="start"/>
-      <w:pPr>
-        <w:tabs>
-          <w:tab w:pos="252pt" w:val="num"/>
-        </w:tabs>
-        <w:ind w:hanging="36pt" w:start="252pt"/>
-      </w:pPr>
-    </w:lvl>
-    <w:lvl w:ilvl="7">
-      <w:start w:val="1"/>
-      <w:numFmt w:val="decimal"/>
-      <w:lvlText w:val="%8."/>
-      <w:lvlJc w:val="start"/>
-      <w:pPr>
-        <w:tabs>
-          <w:tab w:pos="288pt" w:val="num"/>
-        </w:tabs>
-        <w:ind w:hanging="36pt" w:start="288pt"/>
-      </w:pPr>
-    </w:lvl>
-    <w:lvl w:ilvl="8">
-      <w:start w:val="1"/>
-      <w:numFmt w:val="decimal"/>
-      <w:lvlText w:val="%9."/>
-      <w:lvlJc w:val="start"/>
-      <w:pPr>
-        <w:tabs>
-          <w:tab w:pos="324pt" w:val="num"/>
-        </w:tabs>
-        <w:ind w:hanging="36pt" w:start="324pt"/>
-      </w:pPr>
-    </w:lvl>
-  </w:abstractNum>
-  <w:abstractNum w:abstractNumId="2" w15:restartNumberingAfterBreak="0">
-    <w:nsid w:val="49B43C53"/>
-    <w:multiLevelType w:val="multilevel"/>
-    <w:tmpl w:val="F63AA3D6"/>
-    <w:lvl w:ilvl="0">
-      <w:start w:val="1"/>
-      <w:numFmt w:val="decimal"/>
-      <w:lvlText w:val="%1."/>
-      <w:lvlJc w:val="start"/>
-      <w:pPr>
-        <w:ind w:firstLine="0pt" w:start="0pt"/>
-      </w:pPr>
-    </w:lvl>
-    <w:lvl w:ilvl="1">
-      <w:start w:val="1"/>
-      <w:numFmt w:val="decimal"/>
-      <w:lvlText w:val="%1.%2."/>
-      <w:lvlJc w:val="start"/>
-      <w:pPr>
-        <w:ind w:firstLine="0pt" w:start="127.60pt"/>
-      </w:pPr>
-    </w:lvl>
-    <w:lvl w:ilvl="2">
-      <w:start w:val="1"/>
-      <w:numFmt w:val="decimal"/>
-      <w:pStyle w:val="Nagwek31"/>
-      <w:lvlText w:val="%1.%2.%3."/>
-      <w:lvlJc w:val="start"/>
-      <w:pPr>
-        <w:ind w:firstLine="0pt" w:start="0pt"/>
-      </w:pPr>
-    </w:lvl>
-    <w:lvl w:ilvl="3">
-      <w:start w:val="1"/>
-      <w:numFmt w:val="decimal"/>
-      <w:lvlText w:val="%1.%2.%3.%4."/>
-      <w:lvlJc w:val="start"/>
-      <w:pPr>
-        <w:ind w:firstLine="0pt" w:start="0pt"/>
-      </w:pPr>
-    </w:lvl>
-    <w:lvl w:ilvl="4">
-      <w:start w:val="1"/>
-      <w:numFmt w:val="decimal"/>
-      <w:lvlText w:val="%1.%2.%3.%4.%5."/>
-      <w:lvlJc w:val="start"/>
-      <w:pPr>
-        <w:ind w:firstLine="0pt" w:start="0pt"/>
-      </w:pPr>
-    </w:lvl>
-    <w:lvl w:ilvl="5">
-      <w:start w:val="1"/>
-      <w:numFmt w:val="decimal"/>
-      <w:lvlText w:val="%1.%2.%3.%4.%5.%6."/>
-      <w:lvlJc w:val="start"/>
-      <w:pPr>
-        <w:ind w:firstLine="0pt" w:start="0pt"/>
-      </w:pPr>
-    </w:lvl>
-    <w:lvl w:ilvl="6">
-      <w:start w:val="1"/>
-      <w:numFmt w:val="decimal"/>
-      <w:lvlText w:val="%1.%2.%3.%4.%5.%6.%7."/>
-      <w:lvlJc w:val="start"/>
-      <w:pPr>
-        <w:ind w:firstLine="0pt" w:start="0pt"/>
-      </w:pPr>
-    </w:lvl>
-    <w:lvl w:ilvl="7">
-      <w:start w:val="1"/>
-      <w:numFmt w:val="decimal"/>
-      <w:lvlText w:val="%1.%2.%3.%4.%5.%6.%7.%8."/>
-      <w:lvlJc w:val="start"/>
-      <w:pPr>
-        <w:ind w:firstLine="0pt" w:start="0pt"/>
-      </w:pPr>
-    </w:lvl>
-    <w:lvl w:ilvl="8">
-      <w:start w:val="1"/>
-      <w:numFmt w:val="decimal"/>
-      <w:lvlText w:val="%1.%2.%3.%4.%5.%6.%7.%8.%9."/>
-      <w:lvlJc w:val="start"/>
-      <w:pPr>
-        <w:ind w:firstLine="0pt" w:start="0pt"/>
-      </w:pPr>
-    </w:lvl>
-  </w:abstractNum>
-  <w:abstractNum w:abstractNumId="3" w15:restartNumberingAfterBreak="0">
-    <w:nsid w:val="4FF65977"/>
-    <w:multiLevelType w:val="hybridMultilevel"/>
-    <w:tmpl w:val="CE7AD516"/>
-    <w:lvl w:ilvl="0" w:tplc="5F84AC6E">
-      <w:start w:val="1"/>
-      <w:numFmt w:val="decimal"/>
-      <w:lvlText w:val="%1."/>
-      <w:lvlJc w:val="start"/>
-      <w:pPr>
-        <w:ind w:hanging="18pt" w:start="36pt"/>
-      </w:pPr>
-    </w:lvl>
-    <w:lvl w:ilvl="1" w:tentative="1" w:tplc="04150019">
-      <w:start w:val="1"/>
-      <w:numFmt w:val="lowerLetter"/>
-      <w:lvlText w:val="%2."/>
-      <w:lvlJc w:val="start"/>
-      <w:pPr>
-        <w:ind w:hanging="18pt" w:start="72pt"/>
-      </w:pPr>
-    </w:lvl>
-    <w:lvl w:ilvl="2" w:tentative="1" w:tplc="0415001B">
-      <w:start w:val="1"/>
-      <w:numFmt w:val="lowerRoman"/>
-      <w:lvlText w:val="%3."/>
-      <w:lvlJc w:val="end"/>
-      <w:pPr>
-        <w:ind w:hanging="9pt" w:start="108pt"/>
-      </w:pPr>
-    </w:lvl>
-    <w:lvl w:ilvl="3" w:tentative="1" w:tplc="0415000F">
-      <w:start w:val="1"/>
-      <w:numFmt w:val="decimal"/>
-      <w:lvlText w:val="%4."/>
-      <w:lvlJc w:val="start"/>
-      <w:pPr>
-        <w:ind w:hanging="18pt" w:start="144pt"/>
-      </w:pPr>
-    </w:lvl>
-    <w:lvl w:ilvl="4" w:tentative="1" w:tplc="04150019">
-      <w:start w:val="1"/>
-      <w:numFmt w:val="lowerLetter"/>
-      <w:lvlText w:val="%5."/>
-      <w:lvlJc w:val="start"/>
-      <w:pPr>
-        <w:ind w:hanging="18pt" w:start="180pt"/>
-      </w:pPr>
-    </w:lvl>
-    <w:lvl w:ilvl="5" w:tentative="1" w:tplc="0415001B">
-      <w:start w:val="1"/>
-      <w:numFmt w:val="lowerRoman"/>
-      <w:lvlText w:val="%6."/>
-      <w:lvlJc w:val="end"/>
-      <w:pPr>
-        <w:ind w:hanging="9pt" w:start="216pt"/>
-      </w:pPr>
-    </w:lvl>
-    <w:lvl w:ilvl="6" w:tentative="1" w:tplc="0415000F">
-      <w:start w:val="1"/>
-      <w:numFmt w:val="decimal"/>
-      <w:lvlText w:val="%7."/>
-      <w:lvlJc w:val="start"/>
-      <w:pPr>
-        <w:ind w:hanging="18pt" w:start="252pt"/>
-      </w:pPr>
-    </w:lvl>
-    <w:lvl w:ilvl="7" w:tentative="1" w:tplc="04150019">
-      <w:start w:val="1"/>
-      <w:numFmt w:val="lowerLetter"/>
-      <w:lvlText w:val="%8."/>
-      <w:lvlJc w:val="start"/>
-      <w:pPr>
-        <w:ind w:hanging="18pt" w:start="288pt"/>
-      </w:pPr>
-    </w:lvl>
-    <w:lvl w:ilvl="8" w:tentative="1" w:tplc="0415001B">
-      <w:start w:val="1"/>
-      <w:numFmt w:val="lowerRoman"/>
-      <w:lvlText w:val="%9."/>
-      <w:lvlJc w:val="end"/>
-      <w:pPr>
-        <w:ind w:hanging="9pt" w:start="324pt"/>
-      </w:pPr>
+        <w:ind w:hanging="18pt" w:start="18pt"/>
+      </w:pPr>
+      <w:rPr>
+        <w:rFonts w:ascii="Symbol" w:hAnsi="Symbol" w:hint="default"/>
+      </w:rPr>
     </w:lvl>
   </w:abstractNum>
   <w:abstractNum w:abstractNumId="990">
@@ -1519,16 +1253,10 @@
       </w:pPr>
     </w:lvl>
   </w:abstractNum>
-  <w:num w:numId="1">
-    <w:abstractNumId w:val="2"/>
-  </w:num>
-  <w:num w:numId="2">
-    <w:abstractNumId w:val="3"/>
-  </w:num>
-  <w:num w:numId="3">
+  <w:num w:numId="1" w16cid:durableId="2145811164">
     <w:abstractNumId w:val="1"/>
   </w:num>
-  <w:num w:numId="4">
+  <w:num w:numId="2" w16cid:durableId="1970476543">
     <w:abstractNumId w:val="0"/>
   </w:num>
   <w:num w:numId="1000">
@@ -1544,23 +1272,25 @@
 </file>
 
 <file path=word/styles.xml><?xml version="1.0" encoding="utf-8"?>
-<w:styles xmlns:mc="http://schemas.openxmlformats.org/markup-compatibility/2006" xmlns:r="http://purl.oclc.org/ooxml/officeDocument/relationships" xmlns:w="http://purl.oclc.org/ooxml/wordprocessingml/main" xmlns:w14="http://schemas.microsoft.com/office/word/2010/wordml" xmlns:w15="http://schemas.microsoft.com/office/word/2012/wordml" mc:Ignorable="w14 w15">
+<w:styles xmlns:mc="http://schemas.openxmlformats.org/markup-compatibility/2006" xmlns:r="http://purl.oclc.org/ooxml/officeDocument/relationships" xmlns:w="http://purl.oclc.org/ooxml/wordprocessingml/main" xmlns:w14="http://schemas.microsoft.com/office/word/2010/wordml" xmlns:w15="http://schemas.microsoft.com/office/word/2012/wordml" xmlns:w16="http://schemas.microsoft.com/office/word/2018/wordml" xmlns:w16cex="http://schemas.microsoft.com/office/word/2018/wordml/cex" xmlns:w16cid="http://schemas.microsoft.com/office/word/2016/wordml/cid" xmlns:w16du="http://schemas.microsoft.com/office/word/2023/wordml/word16du" xmlns:w16sdtdh="http://schemas.microsoft.com/office/word/2020/wordml/sdtdatahash" xmlns:w16sdtfl="http://schemas.microsoft.com/office/word/2024/wordml/sdtformatlock" xmlns:w16se="http://schemas.microsoft.com/office/word/2015/wordml/symex" mc:Ignorable="w14 w15 w16se w16cid w16 w16cex w16sdtdh w16sdtfl w16du">
   <w:docDefaults>
     <w:rPrDefault>
       <w:rPr>
         <w:rFonts w:asciiTheme="minorHAnsi" w:cstheme="minorBidi" w:eastAsiaTheme="minorHAnsi" w:hAnsiTheme="minorHAnsi"/>
-        <w:sz w:val="21"/>
-        <w:szCs w:val="21"/>
-        <w:lang w:bidi="ar-SA" w:eastAsia="en-US" w:val="pl-PL"/>
+        <w:kern w:val="2"/>
+        <w:sz w:val="22"/>
+        <w:szCs w:val="22"/>
+        <w:lang w:bidi="ar-SA" w:eastAsia="en-US" w:val="en-GB"/>
+        <w14:ligatures w14:val="standardContextual"/>
       </w:rPr>
     </w:rPrDefault>
     <w:pPrDefault>
       <w:pPr>
-        <w:spacing w:after="8pt" w:line="13.80pt" w:lineRule="auto"/>
+        <w:spacing w:after="8pt" w:line="12.95pt" w:lineRule="auto"/>
       </w:pPr>
     </w:pPrDefault>
   </w:docDefaults>
-  <w:latentStyles w:count="371" w:defLockedState="0" w:defQFormat="0" w:defSemiHidden="0" w:defUIPriority="99" w:defUnhideWhenUsed="0">
+  <w:latentStyles w:count="376" w:defLockedState="0" w:defQFormat="0" w:defSemiHidden="0" w:defUIPriority="99" w:defUnhideWhenUsed="0">
     <w:lsdException w:name="Normal" w:qFormat="1" w:uiPriority="0"/>
     <w:lsdException w:name="heading 1" w:qFormat="1" w:uiPriority="9"/>
     <w:lsdException w:name="heading 2" w:qFormat="1" w:semiHidden="1" w:uiPriority="9" w:unhideWhenUsed="1"/>
@@ -1932,40 +1662,223 @@
     <w:lsdException w:name="List Table 5 Dark Accent 6" w:uiPriority="50"/>
     <w:lsdException w:name="List Table 6 Colorful Accent 6" w:uiPriority="51"/>
     <w:lsdException w:name="List Table 7 Colorful Accent 6" w:uiPriority="52"/>
+    <w:lsdException w:name="Mention" w:semiHidden="1" w:unhideWhenUsed="1"/>
+    <w:lsdException w:name="Smart Hyperlink" w:semiHidden="1" w:unhideWhenUsed="1"/>
+    <w:lsdException w:name="Hashtag" w:semiHidden="1" w:unhideWhenUsed="1"/>
+    <w:lsdException w:name="Unresolved Mention" w:semiHidden="1" w:unhideWhenUsed="1"/>
+    <w:lsdException w:name="Smart Link" w:semiHidden="1" w:unhideWhenUsed="1"/>
   </w:latentStyles>
-  <w:style w:default="1" w:styleId="Normalny" w:type="paragraph">
+  <w:style w:default="1" w:styleId="Normal" w:type="paragraph">
     <w:name w:val="Normal"/>
     <w:qFormat/>
-    <w:rsid w:val="00401DA4"/>
-  </w:style>
-  <w:style w:styleId="Nagwek1" w:type="paragraph">
+    <w:rsid w:val="005966BF"/>
+    <w:pPr>
+      <w:spacing w:line="18pt" w:lineRule="auto"/>
+      <w:jc w:val="both"/>
+    </w:pPr>
+  </w:style>
+  <w:style w:styleId="Heading1" w:type="paragraph">
     <w:name w:val="heading 1"/>
-    <w:basedOn w:val="Normalny"/>
-    <w:next w:val="Normalny"/>
-    <w:link w:val="Nagwek1Znak"/>
+    <w:basedOn w:val="Normal"/>
+    <w:next w:val="Normal"/>
+    <w:link w:val="Heading1Char"/>
     <w:uiPriority w:val="9"/>
     <w:qFormat/>
-    <w:rsid w:val="00DF1295"/>
+    <w:rsid w:val="00797A10"/>
     <w:pPr>
       <w:keepNext/>
       <w:keepLines/>
-      <w:spacing w:after="0pt" w:before="12pt"/>
+      <w:spacing w:after="4pt" w:before="18pt"/>
+      <w:jc w:val="center"/>
       <w:outlineLvl w:val="0"/>
     </w:pPr>
     <w:rPr>
       <w:rFonts w:asciiTheme="majorHAnsi" w:cstheme="majorBidi" w:eastAsiaTheme="majorEastAsia" w:hAnsiTheme="majorHAnsi"/>
-      <w:color w:themeColor="accent1" w:themeShade="BF" w:val="2E74B5"/>
+      <w:sz w:val="48"/>
+      <w:szCs w:val="40"/>
+    </w:rPr>
+  </w:style>
+  <w:style w:styleId="Heading2" w:type="paragraph">
+    <w:name w:val="heading 2"/>
+    <w:basedOn w:val="Heading1"/>
+    <w:next w:val="Normal"/>
+    <w:link w:val="Heading2Char"/>
+    <w:uiPriority w:val="9"/>
+    <w:unhideWhenUsed/>
+    <w:qFormat/>
+    <w:rsid w:val="00797A10"/>
+    <w:pPr>
+      <w:pBdr>
+        <w:bottom w:color="auto" w:space="1" w:sz="4" w:val="single"/>
+      </w:pBdr>
+      <w:spacing w:after="10pt" w:before="14pt"/>
+      <w:outlineLvl w:val="1"/>
+    </w:pPr>
+    <w:rPr>
+      <w:b/>
+      <w:color w:themeColor="accent1" w:themeShade="80" w:val="1F3864"/>
       <w:sz w:val="32"/>
       <w:szCs w:val="32"/>
     </w:rPr>
   </w:style>
-  <w:style w:default="1" w:styleId="Domylnaczcionkaakapitu" w:type="character">
+  <w:style w:styleId="Heading3" w:type="paragraph">
+    <w:name w:val="heading 3"/>
+    <w:basedOn w:val="Heading1"/>
+    <w:next w:val="Normal"/>
+    <w:link w:val="Heading3Char"/>
+    <w:uiPriority w:val="9"/>
+    <w:unhideWhenUsed/>
+    <w:qFormat/>
+    <w:rsid w:val="00797A10"/>
+    <w:pPr>
+      <w:spacing w:before="8pt"/>
+      <w:outlineLvl w:val="2"/>
+    </w:pPr>
+    <w:rPr>
+      <w:b/>
+      <w:sz w:val="24"/>
+      <w:szCs w:val="28"/>
+    </w:rPr>
+  </w:style>
+  <w:style w:styleId="Heading4" w:type="paragraph">
+    <w:name w:val="heading 4"/>
+    <w:basedOn w:val="Normal"/>
+    <w:next w:val="Normal"/>
+    <w:link w:val="Heading4Char"/>
+    <w:uiPriority w:val="9"/>
+    <w:semiHidden/>
+    <w:unhideWhenUsed/>
+    <w:qFormat/>
+    <w:rsid w:val="00797A10"/>
+    <w:pPr>
+      <w:keepNext/>
+      <w:keepLines/>
+      <w:spacing w:after="2pt" w:before="4pt"/>
+      <w:outlineLvl w:val="3"/>
+    </w:pPr>
+    <w:rPr>
+      <w:rFonts w:cstheme="majorBidi" w:eastAsiaTheme="majorEastAsia"/>
+      <w:i/>
+      <w:iCs/>
+      <w:color w:themeColor="accent1" w:themeShade="BF" w:val="2F5496"/>
+    </w:rPr>
+  </w:style>
+  <w:style w:styleId="Heading5" w:type="paragraph">
+    <w:name w:val="heading 5"/>
+    <w:basedOn w:val="Normal"/>
+    <w:next w:val="Normal"/>
+    <w:link w:val="Heading5Char"/>
+    <w:uiPriority w:val="9"/>
+    <w:semiHidden/>
+    <w:unhideWhenUsed/>
+    <w:qFormat/>
+    <w:rsid w:val="00797A10"/>
+    <w:pPr>
+      <w:keepNext/>
+      <w:keepLines/>
+      <w:spacing w:after="2pt" w:before="4pt"/>
+      <w:outlineLvl w:val="4"/>
+    </w:pPr>
+    <w:rPr>
+      <w:rFonts w:cstheme="majorBidi" w:eastAsiaTheme="majorEastAsia"/>
+      <w:color w:themeColor="accent1" w:themeShade="BF" w:val="2F5496"/>
+    </w:rPr>
+  </w:style>
+  <w:style w:styleId="Heading6" w:type="paragraph">
+    <w:name w:val="heading 6"/>
+    <w:basedOn w:val="Normal"/>
+    <w:next w:val="Normal"/>
+    <w:link w:val="Heading6Char"/>
+    <w:uiPriority w:val="9"/>
+    <w:semiHidden/>
+    <w:unhideWhenUsed/>
+    <w:qFormat/>
+    <w:rsid w:val="00797A10"/>
+    <w:pPr>
+      <w:keepNext/>
+      <w:keepLines/>
+      <w:spacing w:after="0pt" w:before="2pt"/>
+      <w:outlineLvl w:val="5"/>
+    </w:pPr>
+    <w:rPr>
+      <w:rFonts w:cstheme="majorBidi" w:eastAsiaTheme="majorEastAsia"/>
+      <w:i/>
+      <w:iCs/>
+      <w:color w:themeColor="text1" w:themeTint="A6" w:val="595959"/>
+    </w:rPr>
+  </w:style>
+  <w:style w:styleId="Heading7" w:type="paragraph">
+    <w:name w:val="heading 7"/>
+    <w:basedOn w:val="Normal"/>
+    <w:next w:val="Normal"/>
+    <w:link w:val="Heading7Char"/>
+    <w:uiPriority w:val="9"/>
+    <w:semiHidden/>
+    <w:unhideWhenUsed/>
+    <w:qFormat/>
+    <w:rsid w:val="00797A10"/>
+    <w:pPr>
+      <w:keepNext/>
+      <w:keepLines/>
+      <w:spacing w:after="0pt" w:before="2pt"/>
+      <w:outlineLvl w:val="6"/>
+    </w:pPr>
+    <w:rPr>
+      <w:rFonts w:cstheme="majorBidi" w:eastAsiaTheme="majorEastAsia"/>
+      <w:color w:themeColor="text1" w:themeTint="A6" w:val="595959"/>
+    </w:rPr>
+  </w:style>
+  <w:style w:styleId="Heading8" w:type="paragraph">
+    <w:name w:val="heading 8"/>
+    <w:basedOn w:val="Normal"/>
+    <w:next w:val="Normal"/>
+    <w:link w:val="Heading8Char"/>
+    <w:uiPriority w:val="9"/>
+    <w:semiHidden/>
+    <w:unhideWhenUsed/>
+    <w:qFormat/>
+    <w:rsid w:val="00797A10"/>
+    <w:pPr>
+      <w:keepNext/>
+      <w:keepLines/>
+      <w:spacing w:after="0pt"/>
+      <w:outlineLvl w:val="7"/>
+    </w:pPr>
+    <w:rPr>
+      <w:rFonts w:cstheme="majorBidi" w:eastAsiaTheme="majorEastAsia"/>
+      <w:i/>
+      <w:iCs/>
+      <w:color w:themeColor="text1" w:themeTint="D8" w:val="272727"/>
+    </w:rPr>
+  </w:style>
+  <w:style w:styleId="Heading9" w:type="paragraph">
+    <w:name w:val="heading 9"/>
+    <w:basedOn w:val="Normal"/>
+    <w:next w:val="Normal"/>
+    <w:link w:val="Heading9Char"/>
+    <w:uiPriority w:val="9"/>
+    <w:semiHidden/>
+    <w:unhideWhenUsed/>
+    <w:qFormat/>
+    <w:rsid w:val="00797A10"/>
+    <w:pPr>
+      <w:keepNext/>
+      <w:keepLines/>
+      <w:spacing w:after="0pt"/>
+      <w:outlineLvl w:val="8"/>
+    </w:pPr>
+    <w:rPr>
+      <w:rFonts w:cstheme="majorBidi" w:eastAsiaTheme="majorEastAsia"/>
+      <w:color w:themeColor="text1" w:themeTint="D8" w:val="272727"/>
+    </w:rPr>
+  </w:style>
+  <w:style w:default="1" w:styleId="DefaultParagraphFont" w:type="character">
     <w:name w:val="Default Paragraph Font"/>
     <w:uiPriority w:val="1"/>
     <w:semiHidden/>
     <w:unhideWhenUsed/>
   </w:style>
-  <w:style w:default="1" w:styleId="Standardowy" w:type="table">
+  <w:style w:default="1" w:styleId="TableNormal" w:type="table">
     <w:name w:val="Normal Table"/>
     <w:uiPriority w:val="99"/>
     <w:semiHidden/>
@@ -1980,297 +1893,363 @@
       </w:tblCellMar>
     </w:tblPr>
   </w:style>
-  <w:style w:default="1" w:styleId="Bezlisty" w:type="numbering">
+  <w:style w:default="1" w:styleId="NoList" w:type="numbering">
     <w:name w:val="No List"/>
     <w:uiPriority w:val="99"/>
     <w:semiHidden/>
     <w:unhideWhenUsed/>
   </w:style>
-  <w:style w:customStyle="1" w:styleId="Nagwek31" w:type="paragraph">
-    <w:name w:val="Nagłówek 31"/>
-    <w:basedOn w:val="Normalny"/>
-    <w:next w:val="Normalny"/>
+  <w:style w:customStyle="1" w:styleId="Heading1Char" w:type="character">
+    <w:name w:val="Heading 1 Char"/>
+    <w:basedOn w:val="DefaultParagraphFont"/>
+    <w:link w:val="Heading1"/>
+    <w:uiPriority w:val="9"/>
+    <w:rsid w:val="00797A10"/>
+    <w:rPr>
+      <w:rFonts w:asciiTheme="majorHAnsi" w:cstheme="majorBidi" w:eastAsiaTheme="majorEastAsia" w:hAnsiTheme="majorHAnsi"/>
+      <w:sz w:val="48"/>
+      <w:szCs w:val="40"/>
+    </w:rPr>
+  </w:style>
+  <w:style w:customStyle="1" w:styleId="Heading2Char" w:type="character">
+    <w:name w:val="Heading 2 Char"/>
+    <w:basedOn w:val="DefaultParagraphFont"/>
+    <w:link w:val="Heading2"/>
+    <w:uiPriority w:val="9"/>
+    <w:rsid w:val="00797A10"/>
+    <w:rPr>
+      <w:rFonts w:asciiTheme="majorHAnsi" w:cstheme="majorBidi" w:eastAsiaTheme="majorEastAsia" w:hAnsiTheme="majorHAnsi"/>
+      <w:b/>
+      <w:color w:themeColor="accent1" w:themeShade="80" w:val="1F3864"/>
+      <w:sz w:val="32"/>
+      <w:szCs w:val="32"/>
+    </w:rPr>
+  </w:style>
+  <w:style w:customStyle="1" w:styleId="Heading3Char" w:type="character">
+    <w:name w:val="Heading 3 Char"/>
+    <w:basedOn w:val="DefaultParagraphFont"/>
+    <w:link w:val="Heading3"/>
+    <w:uiPriority w:val="9"/>
+    <w:rsid w:val="00797A10"/>
+    <w:rPr>
+      <w:rFonts w:asciiTheme="majorHAnsi" w:cstheme="majorBidi" w:eastAsiaTheme="majorEastAsia" w:hAnsiTheme="majorHAnsi"/>
+      <w:b/>
+      <w:sz w:val="24"/>
+      <w:szCs w:val="28"/>
+    </w:rPr>
+  </w:style>
+  <w:style w:customStyle="1" w:styleId="Heading4Char" w:type="character">
+    <w:name w:val="Heading 4 Char"/>
+    <w:basedOn w:val="DefaultParagraphFont"/>
+    <w:link w:val="Heading4"/>
+    <w:uiPriority w:val="9"/>
+    <w:semiHidden/>
+    <w:rsid w:val="00797A10"/>
+    <w:rPr>
+      <w:rFonts w:cstheme="majorBidi" w:eastAsiaTheme="majorEastAsia"/>
+      <w:i/>
+      <w:iCs/>
+      <w:color w:themeColor="accent1" w:themeShade="BF" w:val="2F5496"/>
+    </w:rPr>
+  </w:style>
+  <w:style w:customStyle="1" w:styleId="Heading5Char" w:type="character">
+    <w:name w:val="Heading 5 Char"/>
+    <w:basedOn w:val="DefaultParagraphFont"/>
+    <w:link w:val="Heading5"/>
+    <w:uiPriority w:val="9"/>
+    <w:semiHidden/>
+    <w:rsid w:val="00797A10"/>
+    <w:rPr>
+      <w:rFonts w:cstheme="majorBidi" w:eastAsiaTheme="majorEastAsia"/>
+      <w:color w:themeColor="accent1" w:themeShade="BF" w:val="2F5496"/>
+    </w:rPr>
+  </w:style>
+  <w:style w:customStyle="1" w:styleId="Heading6Char" w:type="character">
+    <w:name w:val="Heading 6 Char"/>
+    <w:basedOn w:val="DefaultParagraphFont"/>
+    <w:link w:val="Heading6"/>
+    <w:uiPriority w:val="9"/>
+    <w:semiHidden/>
+    <w:rsid w:val="00797A10"/>
+    <w:rPr>
+      <w:rFonts w:cstheme="majorBidi" w:eastAsiaTheme="majorEastAsia"/>
+      <w:i/>
+      <w:iCs/>
+      <w:color w:themeColor="text1" w:themeTint="A6" w:val="595959"/>
+    </w:rPr>
+  </w:style>
+  <w:style w:customStyle="1" w:styleId="Heading7Char" w:type="character">
+    <w:name w:val="Heading 7 Char"/>
+    <w:basedOn w:val="DefaultParagraphFont"/>
+    <w:link w:val="Heading7"/>
+    <w:uiPriority w:val="9"/>
+    <w:semiHidden/>
+    <w:rsid w:val="00797A10"/>
+    <w:rPr>
+      <w:rFonts w:cstheme="majorBidi" w:eastAsiaTheme="majorEastAsia"/>
+      <w:color w:themeColor="text1" w:themeTint="A6" w:val="595959"/>
+    </w:rPr>
+  </w:style>
+  <w:style w:customStyle="1" w:styleId="Heading8Char" w:type="character">
+    <w:name w:val="Heading 8 Char"/>
+    <w:basedOn w:val="DefaultParagraphFont"/>
+    <w:link w:val="Heading8"/>
+    <w:uiPriority w:val="9"/>
+    <w:semiHidden/>
+    <w:rsid w:val="00797A10"/>
+    <w:rPr>
+      <w:rFonts w:cstheme="majorBidi" w:eastAsiaTheme="majorEastAsia"/>
+      <w:i/>
+      <w:iCs/>
+      <w:color w:themeColor="text1" w:themeTint="D8" w:val="272727"/>
+    </w:rPr>
+  </w:style>
+  <w:style w:customStyle="1" w:styleId="Heading9Char" w:type="character">
+    <w:name w:val="Heading 9 Char"/>
+    <w:basedOn w:val="DefaultParagraphFont"/>
+    <w:link w:val="Heading9"/>
+    <w:uiPriority w:val="9"/>
+    <w:semiHidden/>
+    <w:rsid w:val="00797A10"/>
+    <w:rPr>
+      <w:rFonts w:cstheme="majorBidi" w:eastAsiaTheme="majorEastAsia"/>
+      <w:color w:themeColor="text1" w:themeTint="D8" w:val="272727"/>
+    </w:rPr>
+  </w:style>
+  <w:style w:styleId="Title" w:type="paragraph">
+    <w:name w:val="Title"/>
+    <w:basedOn w:val="Normal"/>
+    <w:next w:val="Normal"/>
+    <w:link w:val="TitleChar"/>
+    <w:uiPriority w:val="10"/>
+    <w:qFormat/>
+    <w:rsid w:val="00797A10"/>
+    <w:pPr>
+      <w:spacing w:after="4pt" w:line="12pt" w:lineRule="auto"/>
+      <w:contextualSpacing/>
+    </w:pPr>
+    <w:rPr>
+      <w:rFonts w:asciiTheme="majorHAnsi" w:cstheme="majorBidi" w:eastAsiaTheme="majorEastAsia" w:hAnsiTheme="majorHAnsi"/>
+      <w:spacing w:val="-10"/>
+      <w:kern w:val="28"/>
+      <w:sz w:val="56"/>
+      <w:szCs w:val="56"/>
+    </w:rPr>
+  </w:style>
+  <w:style w:customStyle="1" w:styleId="TitleChar" w:type="character">
+    <w:name w:val="Title Char"/>
+    <w:basedOn w:val="DefaultParagraphFont"/>
+    <w:link w:val="Title"/>
+    <w:uiPriority w:val="10"/>
+    <w:rsid w:val="00797A10"/>
+    <w:rPr>
+      <w:rFonts w:asciiTheme="majorHAnsi" w:cstheme="majorBidi" w:eastAsiaTheme="majorEastAsia" w:hAnsiTheme="majorHAnsi"/>
+      <w:spacing w:val="-10"/>
+      <w:kern w:val="28"/>
+      <w:sz w:val="56"/>
+      <w:szCs w:val="56"/>
+    </w:rPr>
+  </w:style>
+  <w:style w:styleId="Subtitle" w:type="paragraph">
+    <w:name w:val="Subtitle"/>
+    <w:basedOn w:val="Normal"/>
+    <w:next w:val="Normal"/>
+    <w:link w:val="SubtitleChar"/>
+    <w:uiPriority w:val="11"/>
+    <w:qFormat/>
+    <w:rsid w:val="00797A10"/>
+    <w:pPr>
+      <w:numPr>
+        <w:ilvl w:val="1"/>
+      </w:numPr>
+    </w:pPr>
+    <w:rPr>
+      <w:rFonts w:cstheme="majorBidi" w:eastAsiaTheme="majorEastAsia"/>
+      <w:color w:themeColor="text1" w:themeTint="A6" w:val="595959"/>
+      <w:spacing w:val="15"/>
+      <w:sz w:val="28"/>
+      <w:szCs w:val="28"/>
+    </w:rPr>
+  </w:style>
+  <w:style w:customStyle="1" w:styleId="SubtitleChar" w:type="character">
+    <w:name w:val="Subtitle Char"/>
+    <w:basedOn w:val="DefaultParagraphFont"/>
+    <w:link w:val="Subtitle"/>
+    <w:uiPriority w:val="11"/>
+    <w:rsid w:val="00797A10"/>
+    <w:rPr>
+      <w:rFonts w:cstheme="majorBidi" w:eastAsiaTheme="majorEastAsia"/>
+      <w:color w:themeColor="text1" w:themeTint="A6" w:val="595959"/>
+      <w:spacing w:val="15"/>
+      <w:sz w:val="28"/>
+      <w:szCs w:val="28"/>
+    </w:rPr>
+  </w:style>
+  <w:style w:styleId="Quote" w:type="paragraph">
+    <w:name w:val="Quote"/>
+    <w:basedOn w:val="Normal"/>
+    <w:next w:val="Normal"/>
+    <w:link w:val="QuoteChar"/>
+    <w:uiPriority w:val="29"/>
+    <w:qFormat/>
+    <w:rsid w:val="00797A10"/>
+    <w:pPr>
+      <w:spacing w:before="8pt"/>
+      <w:jc w:val="center"/>
+    </w:pPr>
+    <w:rPr>
+      <w:i/>
+      <w:iCs/>
+      <w:color w:themeColor="text1" w:themeTint="BF" w:val="404040"/>
+    </w:rPr>
+  </w:style>
+  <w:style w:customStyle="1" w:styleId="QuoteChar" w:type="character">
+    <w:name w:val="Quote Char"/>
+    <w:basedOn w:val="DefaultParagraphFont"/>
+    <w:link w:val="Quote"/>
+    <w:uiPriority w:val="29"/>
+    <w:rsid w:val="00797A10"/>
+    <w:rPr>
+      <w:i/>
+      <w:iCs/>
+      <w:color w:themeColor="text1" w:themeTint="BF" w:val="404040"/>
+    </w:rPr>
+  </w:style>
+  <w:style w:styleId="ListParagraph" w:type="paragraph">
+    <w:name w:val="List Paragraph"/>
+    <w:basedOn w:val="Normal"/>
+    <w:uiPriority w:val="34"/>
+    <w:qFormat/>
+    <w:rsid w:val="00797A10"/>
+    <w:pPr>
+      <w:ind w:start="36pt"/>
+      <w:contextualSpacing/>
+    </w:pPr>
+  </w:style>
+  <w:style w:styleId="IntenseEmphasis" w:type="character">
+    <w:name w:val="Intense Emphasis"/>
+    <w:basedOn w:val="DefaultParagraphFont"/>
+    <w:uiPriority w:val="21"/>
+    <w:qFormat/>
+    <w:rsid w:val="00797A10"/>
+    <w:rPr>
+      <w:i/>
+      <w:iCs/>
+      <w:color w:themeColor="accent1" w:themeShade="BF" w:val="2F5496"/>
+    </w:rPr>
+  </w:style>
+  <w:style w:styleId="IntenseQuote" w:type="paragraph">
+    <w:name w:val="Intense Quote"/>
+    <w:basedOn w:val="Normal"/>
+    <w:next w:val="Normal"/>
+    <w:link w:val="IntenseQuoteChar"/>
+    <w:uiPriority w:val="30"/>
+    <w:qFormat/>
+    <w:rsid w:val="00797A10"/>
+    <w:pPr>
+      <w:pBdr>
+        <w:top w:color="2F5496" w:space="10" w:sz="4" w:themeColor="accent1" w:themeShade="BF" w:val="single"/>
+        <w:bottom w:color="2F5496" w:space="10" w:sz="4" w:themeColor="accent1" w:themeShade="BF" w:val="single"/>
+      </w:pBdr>
+      <w:spacing w:after="18pt" w:before="18pt"/>
+      <w:ind w:end="43.20pt" w:start="43.20pt"/>
+      <w:jc w:val="center"/>
+    </w:pPr>
+    <w:rPr>
+      <w:i/>
+      <w:iCs/>
+      <w:color w:themeColor="accent1" w:themeShade="BF" w:val="2F5496"/>
+    </w:rPr>
+  </w:style>
+  <w:style w:customStyle="1" w:styleId="IntenseQuoteChar" w:type="character">
+    <w:name w:val="Intense Quote Char"/>
+    <w:basedOn w:val="DefaultParagraphFont"/>
+    <w:link w:val="IntenseQuote"/>
+    <w:uiPriority w:val="30"/>
+    <w:rsid w:val="00797A10"/>
+    <w:rPr>
+      <w:i/>
+      <w:iCs/>
+      <w:color w:themeColor="accent1" w:themeShade="BF" w:val="2F5496"/>
+    </w:rPr>
+  </w:style>
+  <w:style w:styleId="IntenseReference" w:type="character">
+    <w:name w:val="Intense Reference"/>
+    <w:basedOn w:val="DefaultParagraphFont"/>
+    <w:uiPriority w:val="32"/>
+    <w:qFormat/>
+    <w:rsid w:val="00797A10"/>
+    <w:rPr>
+      <w:b/>
+      <w:bCs/>
+      <w:smallCaps/>
+      <w:color w:themeColor="accent1" w:themeShade="BF" w:val="2F5496"/>
+      <w:spacing w:val="5"/>
+    </w:rPr>
+  </w:style>
+  <w:style w:styleId="ListBullet" w:type="paragraph">
+    <w:name w:val="List Bullet"/>
+    <w:basedOn w:val="ListBullet2"/>
+    <w:uiPriority w:val="99"/>
     <w:unhideWhenUsed/>
-    <w:qFormat/>
-    <w:rsid w:val="002F5713"/>
+    <w:rsid w:val="00797A10"/>
     <w:pPr>
-      <w:keepNext/>
-      <w:keepLines/>
       <w:numPr>
-        <w:ilvl w:val="2"/>
         <w:numId w:val="1"/>
       </w:numPr>
-      <w:spacing w:after="6pt" w:before="16pt"/>
-      <w:outlineLvl w:val="2"/>
+      <w:spacing w:after="20pt" w:before="12pt"/>
+      <w:ind w:start="36pt"/>
     </w:pPr>
-    <w:rPr>
-      <w:rFonts w:ascii="Calibri" w:cs="Times New Roman" w:eastAsia="Times New Roman" w:hAnsi="Calibri"/>
-      <w:bCs/>
-    </w:rPr>
-  </w:style>
-  <w:style w:customStyle="1" w:styleId="Styl4" w:type="paragraph">
-    <w:name w:val="Styl4"/>
-    <w:basedOn w:val="Nagwek1"/>
-    <w:link w:val="Styl4Znak"/>
-    <w:qFormat/>
-    <w:rsid w:val="00DF1295"/>
-    <w:pPr>
-      <w:numPr>
-        <w:numId w:val="3"/>
-      </w:numPr>
-      <w:ind w:hanging="18pt"/>
-    </w:pPr>
-    <w:rPr>
-      <w:rFonts w:eastAsia="Arial"/>
-    </w:rPr>
-  </w:style>
-  <w:style w:customStyle="1" w:styleId="Styl4Znak" w:type="character">
-    <w:name w:val="Styl4 Znak"/>
-    <w:basedOn w:val="Nagwek1Znak"/>
-    <w:link w:val="Styl4"/>
-    <w:rsid w:val="00DF1295"/>
-    <w:rPr>
-      <w:rFonts w:asciiTheme="majorHAnsi" w:cstheme="majorBidi" w:eastAsia="Arial" w:hAnsiTheme="majorHAnsi"/>
-      <w:color w:themeColor="accent1" w:themeShade="BF" w:val="2E74B5"/>
-      <w:sz w:val="32"/>
-      <w:szCs w:val="32"/>
-    </w:rPr>
-  </w:style>
-  <w:style w:customStyle="1" w:styleId="Nagwek1Znak" w:type="character">
-    <w:name w:val="Nagłówek 1 Znak"/>
-    <w:basedOn w:val="Domylnaczcionkaakapitu"/>
-    <w:link w:val="Nagwek1"/>
-    <w:uiPriority w:val="9"/>
-    <w:rsid w:val="00DF1295"/>
-    <w:rPr>
-      <w:rFonts w:asciiTheme="majorHAnsi" w:cstheme="majorBidi" w:eastAsiaTheme="majorEastAsia" w:hAnsiTheme="majorHAnsi"/>
-      <w:color w:themeColor="accent1" w:themeShade="BF" w:val="2E74B5"/>
-      <w:sz w:val="32"/>
-      <w:szCs w:val="32"/>
-    </w:rPr>
-  </w:style>
-  <w:style w:customStyle="1" w:styleId="heading1cV" w:type="paragraph">
-    <w:name w:val="heading 1 cV"/>
-    <w:basedOn w:val="Nagwek1"/>
-    <w:link w:val="heading1cVZnak"/>
-    <w:qFormat/>
-    <w:rsid w:val="00ED2EA3"/>
-    <w:pPr>
-      <w:jc w:val="center"/>
-    </w:pPr>
-    <w:rPr>
-      <w:color w:val="auto"/>
-      <w:sz w:val="48"/>
-    </w:rPr>
-  </w:style>
-  <w:style w:customStyle="1" w:styleId="heading2cv" w:type="paragraph">
-    <w:name w:val="heading 2 cv"/>
-    <w:basedOn w:val="heading1cV"/>
-    <w:link w:val="heading2cvZnak"/>
-    <w:qFormat/>
-    <w:rsid w:val="00ED2EA3"/>
-    <w:pPr>
-      <w:pBdr>
-        <w:bottom w:color="auto" w:space="1" w:sz="4" w:val="single"/>
-      </w:pBdr>
-      <w:spacing w:after="6pt" w:before="18pt"/>
-    </w:pPr>
-    <w:rPr>
-      <w:b/>
-      <w:color w:themeColor="accent1" w:themeShade="80" w:val="1F4E79"/>
-      <w:sz w:val="32"/>
-    </w:rPr>
-  </w:style>
-  <w:style w:customStyle="1" w:styleId="heading1cVZnak" w:type="character">
-    <w:name w:val="heading 1 cV Znak"/>
-    <w:basedOn w:val="Nagwek1Znak"/>
-    <w:link w:val="heading1cV"/>
-    <w:rsid w:val="00ED2EA3"/>
-    <w:rPr>
-      <w:rFonts w:asciiTheme="majorHAnsi" w:cstheme="majorBidi" w:eastAsiaTheme="majorEastAsia" w:hAnsiTheme="majorHAnsi"/>
-      <w:color w:themeColor="accent1" w:themeShade="BF" w:val="2E74B5"/>
-      <w:sz w:val="48"/>
-      <w:szCs w:val="32"/>
-    </w:rPr>
-  </w:style>
-  <w:style w:customStyle="1" w:styleId="heading3cv" w:type="paragraph">
-    <w:name w:val="heading 3 cv"/>
-    <w:basedOn w:val="heading1cV"/>
-    <w:link w:val="heading3cvZnak"/>
-    <w:qFormat/>
-    <w:rsid w:val="00805F09"/>
-    <w:rPr>
-      <w:b/>
-      <w:sz w:val="24"/>
-    </w:rPr>
-  </w:style>
-  <w:style w:customStyle="1" w:styleId="heading2cvZnak" w:type="character">
-    <w:name w:val="heading 2 cv Znak"/>
-    <w:basedOn w:val="heading1cVZnak"/>
-    <w:link w:val="heading2cv"/>
-    <w:rsid w:val="00ED2EA3"/>
-    <w:rPr>
-      <w:rFonts w:asciiTheme="majorHAnsi" w:cstheme="majorBidi" w:eastAsiaTheme="majorEastAsia" w:hAnsiTheme="majorHAnsi"/>
-      <w:b/>
-      <w:color w:themeColor="accent1" w:themeShade="80" w:val="1F4E79"/>
-      <w:sz w:val="32"/>
-      <w:szCs w:val="32"/>
-    </w:rPr>
-  </w:style>
-  <w:style w:customStyle="1" w:styleId="normalcv" w:type="paragraph">
-    <w:name w:val="normal cv"/>
-    <w:basedOn w:val="heading3cv"/>
-    <w:link w:val="normalcvZnak"/>
-    <w:qFormat/>
-    <w:rsid w:val="00805F09"/>
-    <w:pPr>
-      <w:spacing w:line="18pt" w:lineRule="auto"/>
-      <w:jc w:val="both"/>
-    </w:pPr>
-    <w:rPr>
-      <w:rFonts w:asciiTheme="minorHAnsi" w:hAnsiTheme="minorHAnsi"/>
-      <w:b w:val="0"/>
-      <w:sz w:val="22"/>
-    </w:rPr>
-  </w:style>
-  <w:style w:customStyle="1" w:styleId="heading3cvZnak" w:type="character">
-    <w:name w:val="heading 3 cv Znak"/>
-    <w:basedOn w:val="heading1cVZnak"/>
-    <w:link w:val="heading3cv"/>
-    <w:rsid w:val="00805F09"/>
-    <w:rPr>
-      <w:rFonts w:asciiTheme="majorHAnsi" w:cstheme="majorBidi" w:eastAsiaTheme="majorEastAsia" w:hAnsiTheme="majorHAnsi"/>
-      <w:b/>
-      <w:color w:themeColor="accent1" w:themeShade="BF" w:val="2E74B5"/>
-      <w:sz w:val="24"/>
-      <w:szCs w:val="32"/>
-    </w:rPr>
-  </w:style>
-  <w:style w:customStyle="1" w:styleId="listbulletcv" w:type="paragraph">
-    <w:name w:val="list bullet cv"/>
-    <w:basedOn w:val="Listapunktowana"/>
-    <w:link w:val="listbulletcvZnak"/>
-    <w:qFormat/>
-    <w:rsid w:val="00805F09"/>
-    <w:pPr>
-      <w:spacing w:after="0pt" w:before="12pt" w:line="18pt" w:lineRule="auto"/>
-      <w:ind w:start="35.40pt"/>
-    </w:pPr>
-    <w:rPr>
-      <w:sz w:val="22"/>
-    </w:rPr>
-  </w:style>
-  <w:style w:customStyle="1" w:styleId="normalcvZnak" w:type="character">
-    <w:name w:val="normal cv Znak"/>
-    <w:basedOn w:val="heading3cvZnak"/>
-    <w:link w:val="normalcv"/>
-    <w:rsid w:val="00805F09"/>
-    <w:rPr>
-      <w:rFonts w:asciiTheme="majorHAnsi" w:cstheme="majorBidi" w:eastAsiaTheme="majorEastAsia" w:hAnsiTheme="majorHAnsi"/>
-      <w:b w:val="0"/>
-      <w:color w:themeColor="accent1" w:themeShade="BF" w:val="2E74B5"/>
-      <w:sz w:val="22"/>
-      <w:szCs w:val="32"/>
-    </w:rPr>
-  </w:style>
-  <w:style w:customStyle="1" w:styleId="strong" w:type="character">
-    <w:name w:val="strong"/>
-    <w:basedOn w:val="Domylnaczcionkaakapitu"/>
-    <w:uiPriority w:val="1"/>
-    <w:qFormat/>
-    <w:rsid w:val="00EC37B7"/>
-    <w:rPr>
-      <w:b/>
-    </w:rPr>
-  </w:style>
-  <w:style w:customStyle="1" w:styleId="listbulletcvZnak" w:type="character">
-    <w:name w:val="list bullet cv Znak"/>
-    <w:basedOn w:val="normalcvZnak"/>
-    <w:link w:val="listbulletcv"/>
-    <w:rsid w:val="00805F09"/>
-    <w:rPr>
-      <w:rFonts w:asciiTheme="majorHAnsi" w:cstheme="majorBidi" w:eastAsiaTheme="majorEastAsia" w:hAnsiTheme="majorHAnsi"/>
-      <w:b w:val="0"/>
-      <w:color w:themeColor="accent1" w:themeShade="BF" w:val="2E74B5"/>
-      <w:sz w:val="22"/>
-      <w:szCs w:val="32"/>
-    </w:rPr>
-  </w:style>
-  <w:style w:customStyle="1" w:styleId="emphasis" w:type="character">
-    <w:name w:val="emphasis"/>
-    <w:basedOn w:val="Domylnaczcionkaakapitu"/>
-    <w:uiPriority w:val="1"/>
-    <w:qFormat/>
-    <w:rsid w:val="00EC37B7"/>
-    <w:rPr>
-      <w:b w:val="0"/>
-      <w:i/>
-    </w:rPr>
-  </w:style>
-  <w:style w:customStyle="1" w:styleId="hyperlink" w:type="character">
-    <w:name w:val="hyperlink"/>
-    <w:basedOn w:val="Hipercze"/>
-    <w:uiPriority w:val="1"/>
-    <w:qFormat/>
-    <w:rsid w:val="00EC37B7"/>
-    <w:rPr>
-      <w:color w:themeColor="background2" w:themeShade="80" w:val="767171"/>
-      <w:u w:val="none"/>
-    </w:rPr>
-  </w:style>
-  <w:style w:customStyle="1" w:styleId="daty" w:type="paragraph">
-    <w:name w:val="daty"/>
-    <w:basedOn w:val="normalcv"/>
-    <w:link w:val="datyZnak"/>
-    <w:qFormat/>
-    <w:rsid w:val="00805F09"/>
-    <w:pPr>
-      <w:jc w:val="center"/>
-    </w:pPr>
-    <w:rPr>
-      <w:i/>
-      <w:lang w:val="en-GB"/>
-    </w:rPr>
-  </w:style>
-  <w:style w:styleId="Hipercze" w:type="character">
-    <w:name w:val="Hyperlink"/>
-    <w:basedOn w:val="Domylnaczcionkaakapitu"/>
+  </w:style>
+  <w:style w:styleId="ListBullet2" w:type="paragraph">
+    <w:name w:val="List Bullet 2"/>
+    <w:basedOn w:val="Normal"/>
     <w:uiPriority w:val="99"/>
     <w:semiHidden/>
     <w:unhideWhenUsed/>
-    <w:rsid w:val="00EC37B7"/>
-    <w:rPr>
-      <w:color w:themeColor="hyperlink" w:val="0563C1"/>
-      <w:u w:val="single"/>
-    </w:rPr>
-  </w:style>
-  <w:style w:styleId="Listapunktowana" w:type="paragraph">
-    <w:name w:val="List Bullet"/>
-    <w:basedOn w:val="Normalny"/>
-    <w:uiPriority w:val="99"/>
-    <w:semiHidden/>
-    <w:unhideWhenUsed/>
-    <w:rsid w:val="00805F09"/>
+    <w:rsid w:val="00797A10"/>
     <w:pPr>
       <w:numPr>
-        <w:numId w:val="4"/>
+        <w:numId w:val="2"/>
       </w:numPr>
       <w:contextualSpacing/>
     </w:pPr>
   </w:style>
-  <w:style w:customStyle="1" w:styleId="datyZnak" w:type="character">
-    <w:name w:val="daty Znak"/>
-    <w:basedOn w:val="normalcvZnak"/>
-    <w:link w:val="daty"/>
-    <w:rsid w:val="00805F09"/>
-    <w:rPr>
-      <w:rFonts w:asciiTheme="majorHAnsi" w:cstheme="majorBidi" w:eastAsiaTheme="majorEastAsia" w:hAnsiTheme="majorHAnsi"/>
-      <w:b w:val="0"/>
+  <w:style w:styleId="Hyperlink" w:type="character">
+    <w:name w:val="Hyperlink"/>
+    <w:basedOn w:val="DefaultParagraphFont"/>
+    <w:uiPriority w:val="99"/>
+    <w:unhideWhenUsed/>
+    <w:rsid w:val="005966BF"/>
+    <w:rPr>
+      <w:color w:themeColor="background2" w:themeShade="80" w:val="767171"/>
+      <w:u w:val="none"/>
+    </w:rPr>
+  </w:style>
+  <w:style w:styleId="Emphasis" w:type="character">
+    <w:name w:val="Emphasis"/>
+    <w:basedOn w:val="DefaultParagraphFont"/>
+    <w:uiPriority w:val="20"/>
+    <w:qFormat/>
+    <w:rsid w:val="005966BF"/>
+    <w:rPr>
+      <w:rFonts w:asciiTheme="minorHAnsi" w:hAnsiTheme="minorHAnsi"/>
       <w:i/>
-      <w:color w:themeColor="accent1" w:themeShade="BF" w:val="2E74B5"/>
+      <w:iCs/>
       <w:sz w:val="22"/>
-      <w:szCs w:val="32"/>
-      <w:lang w:val="en-GB"/>
+    </w:rPr>
+  </w:style>
+  <w:style w:styleId="Strong" w:type="character">
+    <w:name w:val="Strong"/>
+    <w:basedOn w:val="DefaultParagraphFont"/>
+    <w:uiPriority w:val="22"/>
+    <w:qFormat/>
+    <w:rsid w:val="005966BF"/>
+    <w:rPr>
+      <w:rFonts w:asciiTheme="minorHAnsi" w:hAnsiTheme="minorHAnsi"/>
+      <w:b/>
+      <w:bCs/>
+      <w:sz w:val="22"/>
     </w:rPr>
   </w:style>
   <w:style w:type="paragraph" w:customStyle="1" w:styleId="SourceCode">
@@ -2527,7 +2506,7 @@
         <a:srgbClr val="E7E6E6"/>
       </a:lt2>
       <a:accent1>
-        <a:srgbClr val="5B9BD5"/>
+        <a:srgbClr val="4472C4"/>
       </a:accent1>
       <a:accent2>
         <a:srgbClr val="ED7D31"/>
@@ -2539,7 +2518,7 @@
         <a:srgbClr val="FFC000"/>
       </a:accent4>
       <a:accent5>
-        <a:srgbClr val="4472C4"/>
+        <a:srgbClr val="5B9BD5"/>
       </a:accent5>
       <a:accent6>
         <a:srgbClr val="70AD47"/>
@@ -2556,9 +2535,9 @@
         <a:latin typeface="Calibri Light" panose="020F0302020204030204"/>
         <a:ea typeface=""/>
         <a:cs typeface=""/>
-        <a:font script="Jpan" typeface="ＭＳ ゴシック"/>
+        <a:font script="Jpan" typeface="游ゴシック Light"/>
         <a:font script="Hang" typeface="맑은 고딕"/>
-        <a:font script="Hans" typeface="宋体"/>
+        <a:font script="Hans" typeface="等线 Light"/>
         <a:font script="Hant" typeface="新細明體"/>
         <a:font script="Arab" typeface="Times New Roman"/>
         <a:font script="Hebr" typeface="Times New Roman"/>
@@ -2586,14 +2565,31 @@
         <a:font script="Viet" typeface="Times New Roman"/>
         <a:font script="Uigh" typeface="Microsoft Uighur"/>
         <a:font script="Geor" typeface="Sylfaen"/>
+        <a:font script="Armn" typeface="Arial"/>
+        <a:font script="Bugi" typeface="Leelawadee UI"/>
+        <a:font script="Bopo" typeface="Microsoft JhengHei"/>
+        <a:font script="Java" typeface="Javanese Text"/>
+        <a:font script="Lisu" typeface="Segoe UI"/>
+        <a:font script="Mymr" typeface="Myanmar Text"/>
+        <a:font script="Nkoo" typeface="Ebrima"/>
+        <a:font script="Olck" typeface="Nirmala UI"/>
+        <a:font script="Osma" typeface="Ebrima"/>
+        <a:font script="Phag" typeface="Phagspa"/>
+        <a:font script="Syrn" typeface="Estrangelo Edessa"/>
+        <a:font script="Syrj" typeface="Estrangelo Edessa"/>
+        <a:font script="Syre" typeface="Estrangelo Edessa"/>
+        <a:font script="Sora" typeface="Nirmala UI"/>
+        <a:font script="Tale" typeface="Microsoft Tai Le"/>
+        <a:font script="Talu" typeface="Microsoft New Tai Lue"/>
+        <a:font script="Tfng" typeface="Ebrima"/>
       </a:majorFont>
       <a:minorFont>
         <a:latin typeface="Calibri" panose="020F0502020204030204"/>
         <a:ea typeface=""/>
         <a:cs typeface=""/>
-        <a:font script="Jpan" typeface="ＭＳ 明朝"/>
+        <a:font script="Jpan" typeface="游明朝"/>
         <a:font script="Hang" typeface="맑은 고딕"/>
-        <a:font script="Hans" typeface="宋体"/>
+        <a:font script="Hans" typeface="等线"/>
         <a:font script="Hant" typeface="新細明體"/>
         <a:font script="Arab" typeface="Arial"/>
         <a:font script="Hebr" typeface="Arial"/>
@@ -2621,6 +2617,23 @@
         <a:font script="Viet" typeface="Arial"/>
         <a:font script="Uigh" typeface="Microsoft Uighur"/>
         <a:font script="Geor" typeface="Sylfaen"/>
+        <a:font script="Armn" typeface="Arial"/>
+        <a:font script="Bugi" typeface="Leelawadee UI"/>
+        <a:font script="Bopo" typeface="Microsoft JhengHei"/>
+        <a:font script="Java" typeface="Javanese Text"/>
+        <a:font script="Lisu" typeface="Segoe UI"/>
+        <a:font script="Mymr" typeface="Myanmar Text"/>
+        <a:font script="Nkoo" typeface="Ebrima"/>
+        <a:font script="Olck" typeface="Nirmala UI"/>
+        <a:font script="Osma" typeface="Ebrima"/>
+        <a:font script="Phag" typeface="Phagspa"/>
+        <a:font script="Syrn" typeface="Estrangelo Edessa"/>
+        <a:font script="Syrj" typeface="Estrangelo Edessa"/>
+        <a:font script="Syre" typeface="Estrangelo Edessa"/>
+        <a:font script="Sora" typeface="Nirmala UI"/>
+        <a:font script="Tale" typeface="Microsoft Tai Le"/>
+        <a:font script="Talu" typeface="Microsoft New Tai Lue"/>
+        <a:font script="Tfng" typeface="Ebrima"/>
       </a:minorFont>
     </a:fontScheme>
     <a:fmtScheme name="Pakiet Office">

</xml_diff>